<commit_message>
Add client activation and financial scope notices.
Persist newly onboarded clients into the admin portfolio, allow admins to activate clients from Client Details, and clarify where franchise financials are tracked in the UI and admin guide.

Co-authored-by: Cursor <cursoragent@cursor.com>
</commit_message>
<xml_diff>
--- a/docs/admin-user-guide.docx
+++ b/docs/admin-user-guide.docx
@@ -74,7 +74,7 @@
           <w:color w:val="0F172A"/>
           <w:sz w:val="22"/>
         </w:rPr>
-        <w:t>A click-by-click walkthrough of the Admin franchise module: sign in, read the Financials Dashboard, confirm collections, open seeded clients, and add a new client through the four-step onboarding wizard. Internet Credits, wallets, sales, and downline roles are covered in the separate User Guide — not in this document.</w:t>
+        <w:t>A click-by-click walkthrough of the Admin franchise module: sign in, read the Financials Dashboard, confirm collections, open clients, and add a new client through the four-step onboarding wizard. Create Franchisee saves that client to this browser and shows it on the Clients list. Internet Credits, wallets, sales, and downline roles are covered in the separate User Guide — not in this document.</w:t>
       </w:r>
     </w:p>
     <w:p>
@@ -140,7 +140,7 @@
                 <w:color w:val="0F172A"/>
                 <w:sz w:val="20"/>
               </w:rPr>
-              <w:t>This is a browser-only demo. Data lives in localStorage. There is no backend. Reset Demo Data restores the seeded client portfolio and clears onboarding drafts and collection marks. Screenshots show layout; peso amounts change as you confirm collections.</w:t>
+              <w:t>This is a browser-only demo. Data lives in localStorage. There is no backend. Reset Demo Data restores the seeded client portfolio, removes clients you registered, clears activation overlays, and clears onboarding drafts and collection marks. Screenshots show layout; peso amounts change as you confirm collections.</w:t>
             </w:r>
           </w:p>
         </w:tc>
@@ -896,7 +896,7 @@
           <w:i w:val="0"/>
           <w:sz w:val="22"/>
         </w:rPr>
-        <w:t>Dashboard is the Admin home. It tracks setup fees and monthly collections for the seeded franchise portfolio. Open Franchise Setup in the page header jumps to onboarding step 1 (same wizard as Add New Client).</w:t>
+        <w:t>Dashboard is the Admin home. It tracks setup fees and monthly collections for the franchise portfolio — seeded demo clients plus any clients you register in this browser. Newly registered clients count under Pending Review. Open Franchise Setup in the page header jumps to onboarding step 1 (same wizard as Add New Client).</w:t>
       </w:r>
     </w:p>
     <w:p>
@@ -1571,7 +1571,7 @@
           <w:i w:val="0"/>
           <w:sz w:val="22"/>
         </w:rPr>
-        <w:t>Open Clients in the sidebar. This is the franchise / sub-franchise portfolio. Seeded demo rows include Surigao City Service Hub (Activated Sub-Franchisor) and Siargao General Luna Operator (Franchisee, still in progress).</w:t>
+        <w:t>Open Clients in the sidebar. This is the franchise / sub-franchise portfolio: seeded demo rows plus any clients you create with Add New Client. Newly registered clients appear at the top as Pending Review. Seeded examples include Surigao City Service Hub (Activated Sub-Franchisor) and Siargao General Luna Operator (Franchisee, still in progress).</w:t>
       </w:r>
     </w:p>
     <w:p>
@@ -1627,7 +1627,7 @@
           <w:color w:val="475569"/>
           <w:sz w:val="18"/>
         </w:rPr>
-        <w:t>Clients list — type, status, territories, upfront, billable monthly, and revenue split.</w:t>
+        <w:t>Clients list — newly registered clients appear first, then the seeded demo rows.</w:t>
       </w:r>
     </w:p>
     <w:p>
@@ -2136,7 +2136,7 @@
           <w:i w:val="0"/>
           <w:sz w:val="22"/>
         </w:rPr>
-        <w:t>Client Details shows setup, fees, territories, the revenue-split math, and — for Activated clients — a financial history you can collect against.</w:t>
+        <w:t>Client Details shows setup, fees, territories, the revenue-split math, and — for Activated clients — a financial history you can collect against. Clients you registered also show a Company Profile card (admin, company, contact, and address from step 1). Seeded demo rows do not have that card.</w:t>
       </w:r>
     </w:p>
     <w:p>
@@ -2301,6 +2301,252 @@
     </w:p>
     <w:p>
       <w:pPr>
+        <w:pStyle w:val="Heading2"/>
+        <w:spacing w:before="320" w:after="160"/>
+      </w:pPr>
+      <w:r>
+        <w:rPr>
+          <w:rFonts w:ascii="Calibri" w:hAnsi="Calibri"/>
+          <w:color w:val="0F172A"/>
+        </w:rPr>
+        <w:t>4.3 Activate a client</w:t>
+      </w:r>
+    </w:p>
+    <w:p>
+      <w:pPr>
+        <w:spacing w:after="160" w:before="0" w:line="276" w:lineRule="auto"/>
+      </w:pPr>
+      <w:r>
+        <w:rPr>
+          <w:rFonts w:ascii="Calibri" w:hAnsi="Calibri" w:eastAsia="Calibri"/>
+          <w:b w:val="0"/>
+          <w:i w:val="0"/>
+          <w:sz w:val="22"/>
+        </w:rPr>
+        <w:t>Activation happens on Client Details. There is no separate activation page. Newly registered clients start as Pending Review. Seeded rows that are In Progress or Pending Review can be activated the same way.</w:t>
+      </w:r>
+    </w:p>
+    <w:p>
+      <w:pPr>
+        <w:spacing w:after="80" w:before="0"/>
+        <w:ind w:left="227"/>
+      </w:pPr>
+      <w:r>
+        <w:rPr>
+          <w:rFonts w:ascii="Calibri" w:hAnsi="Calibri" w:eastAsia="Calibri"/>
+          <w:b/>
+          <w:i w:val="0"/>
+          <w:color w:val="1D4ED8"/>
+          <w:sz w:val="22"/>
+        </w:rPr>
+        <w:t xml:space="preserve">1.  </w:t>
+      </w:r>
+      <w:r>
+        <w:rPr>
+          <w:rFonts w:ascii="Calibri" w:hAnsi="Calibri" w:eastAsia="Calibri"/>
+          <w:b w:val="0"/>
+          <w:i w:val="0"/>
+          <w:color w:val="0F172A"/>
+          <w:sz w:val="22"/>
+        </w:rPr>
+        <w:t>Open Clients and click View on a row that is not Activated.</w:t>
+      </w:r>
+    </w:p>
+    <w:p>
+      <w:pPr>
+        <w:spacing w:after="80" w:before="0"/>
+        <w:ind w:left="227"/>
+      </w:pPr>
+      <w:r>
+        <w:rPr>
+          <w:rFonts w:ascii="Calibri" w:hAnsi="Calibri" w:eastAsia="Calibri"/>
+          <w:b/>
+          <w:i w:val="0"/>
+          <w:color w:val="1D4ED8"/>
+          <w:sz w:val="22"/>
+        </w:rPr>
+        <w:t xml:space="preserve">2.  </w:t>
+      </w:r>
+      <w:r>
+        <w:rPr>
+          <w:rFonts w:ascii="Calibri" w:hAnsi="Calibri" w:eastAsia="Calibri"/>
+          <w:b w:val="0"/>
+          <w:i w:val="0"/>
+          <w:color w:val="0F172A"/>
+          <w:sz w:val="22"/>
+        </w:rPr>
+        <w:t>Click Activate Client in the page header, or in the Financial History empty state.</w:t>
+      </w:r>
+    </w:p>
+    <w:p>
+      <w:pPr>
+        <w:spacing w:after="80" w:before="0"/>
+        <w:ind w:left="227"/>
+      </w:pPr>
+      <w:r>
+        <w:rPr>
+          <w:rFonts w:ascii="Calibri" w:hAnsi="Calibri" w:eastAsia="Calibri"/>
+          <w:b/>
+          <w:i w:val="0"/>
+          <w:color w:val="1D4ED8"/>
+          <w:sz w:val="22"/>
+        </w:rPr>
+        <w:t xml:space="preserve">3.  </w:t>
+      </w:r>
+      <w:r>
+        <w:rPr>
+          <w:rFonts w:ascii="Calibri" w:hAnsi="Calibri" w:eastAsia="Calibri"/>
+          <w:b w:val="0"/>
+          <w:i w:val="0"/>
+          <w:color w:val="0F172A"/>
+          <w:sz w:val="22"/>
+        </w:rPr>
+        <w:t>Confirm Activate Client in the dialog.</w:t>
+      </w:r>
+    </w:p>
+    <w:p>
+      <w:pPr>
+        <w:spacing w:after="80" w:before="0"/>
+        <w:ind w:left="227"/>
+      </w:pPr>
+      <w:r>
+        <w:rPr>
+          <w:rFonts w:ascii="Calibri" w:hAnsi="Calibri" w:eastAsia="Calibri"/>
+          <w:b/>
+          <w:i w:val="0"/>
+          <w:color w:val="1D4ED8"/>
+          <w:sz w:val="22"/>
+        </w:rPr>
+        <w:t xml:space="preserve">4.  </w:t>
+      </w:r>
+      <w:r>
+        <w:rPr>
+          <w:rFonts w:ascii="Calibri" w:hAnsi="Calibri" w:eastAsia="Calibri"/>
+          <w:b w:val="0"/>
+          <w:i w:val="0"/>
+          <w:color w:val="0F172A"/>
+          <w:sz w:val="22"/>
+        </w:rPr>
+        <w:t>Status becomes Activated. Financial History appears, and Confirm Collection is enabled on this page and on the Financials Dashboard.</w:t>
+      </w:r>
+    </w:p>
+    <w:p>
+      <w:pPr>
+        <w:spacing w:before="120" w:after="40"/>
+        <w:jc w:val="center"/>
+      </w:pPr>
+      <w:r>
+        <w:drawing>
+          <wp:inline xmlns:a="http://schemas.openxmlformats.org/drawingml/2006/main" xmlns:pic="http://schemas.openxmlformats.org/drawingml/2006/picture">
+            <wp:extent cx="5760720" cy="3600450"/>
+            <wp:docPr id="6" name="Picture 6"/>
+            <wp:cNvGraphicFramePr>
+              <a:graphicFrameLocks noChangeAspect="1"/>
+            </wp:cNvGraphicFramePr>
+            <a:graphic>
+              <a:graphicData uri="http://schemas.openxmlformats.org/drawingml/2006/picture">
+                <pic:pic>
+                  <pic:nvPicPr>
+                    <pic:cNvPr id="0" name="admin-13-activate-client.png"/>
+                    <pic:cNvPicPr/>
+                  </pic:nvPicPr>
+                  <pic:blipFill>
+                    <a:blip r:embed="rId14"/>
+                    <a:stretch>
+                      <a:fillRect/>
+                    </a:stretch>
+                  </pic:blipFill>
+                  <pic:spPr>
+                    <a:xfrm>
+                      <a:off x="0" y="0"/>
+                      <a:ext cx="5760720" cy="3600450"/>
+                    </a:xfrm>
+                    <a:prstGeom prst="rect"/>
+                  </pic:spPr>
+                </pic:pic>
+              </a:graphicData>
+            </a:graphic>
+          </wp:inline>
+        </w:drawing>
+      </w:r>
+    </w:p>
+    <w:p>
+      <w:pPr>
+        <w:spacing w:after="240"/>
+        <w:jc w:val="center"/>
+      </w:pPr>
+      <w:r>
+        <w:rPr>
+          <w:rFonts w:ascii="Calibri" w:hAnsi="Calibri" w:eastAsia="Calibri"/>
+          <w:b w:val="0"/>
+          <w:i/>
+          <w:color w:val="475569"/>
+          <w:sz w:val="18"/>
+        </w:rPr>
+        <w:t>Activate Client confirmation — marks the account live without creating a login.</w:t>
+      </w:r>
+    </w:p>
+    <w:tbl>
+      <w:tblPr>
+        <w:tblW w:type="auto" w:w="0"/>
+        <w:jc w:val="center"/>
+        <w:tblLook w:firstColumn="1" w:firstRow="1" w:lastColumn="0" w:lastRow="0" w:noHBand="0" w:noVBand="1" w:val="04A0"/>
+      </w:tblPr>
+      <w:tblGrid>
+        <w:gridCol w:w="9792"/>
+      </w:tblGrid>
+      <w:tr>
+        <w:tc>
+          <w:tcPr>
+            <w:tcW w:type="dxa" w:w="9792"/>
+            <w:shd w:fill="ECFDF5" w:val="clear"/>
+            <w:tcBorders>
+              <w:top w:val="single" w:sz="4" w:space="0" w:color="C7D2FE"/>
+              <w:left w:val="single" w:sz="4" w:space="0" w:color="C7D2FE"/>
+              <w:bottom w:val="single" w:sz="4" w:space="0" w:color="C7D2FE"/>
+              <w:right w:val="single" w:sz="4" w:space="0" w:color="C7D2FE"/>
+            </w:tcBorders>
+          </w:tcPr>
+          <w:p>
+            <w:pPr>
+              <w:spacing w:after="40"/>
+            </w:pPr>
+            <w:r>
+              <w:rPr>
+                <w:rFonts w:ascii="Calibri" w:hAnsi="Calibri" w:eastAsia="Calibri"/>
+                <w:b/>
+                <w:i w:val="0"/>
+                <w:color w:val="1D4ED8"/>
+                <w:sz w:val="20"/>
+              </w:rPr>
+              <w:t>What activation does</w:t>
+            </w:r>
+          </w:p>
+          <w:p>
+            <w:pPr>
+              <w:spacing w:after="40"/>
+            </w:pPr>
+            <w:r>
+              <w:rPr>
+                <w:rFonts w:ascii="Calibri" w:hAnsi="Calibri" w:eastAsia="Calibri"/>
+                <w:b w:val="0"/>
+                <w:i w:val="0"/>
+                <w:color w:val="0F172A"/>
+                <w:sz w:val="20"/>
+              </w:rPr>
+              <w:t>Activate Client saves Activated plus an activated-at timestamp in this browser. It does not create a sign-in account. Reset Demo Data removes activation overlays and registered clients; seeded demo rows return to their original statuses.</w:t>
+            </w:r>
+          </w:p>
+        </w:tc>
+      </w:tr>
+    </w:tbl>
+    <w:p>
+      <w:pPr>
+        <w:spacing w:after="160"/>
+      </w:pPr>
+    </w:p>
+    <w:p>
+      <w:pPr>
         <w:pStyle w:val="Heading1"/>
         <w:spacing w:before="160" w:after="160"/>
       </w:pPr>
@@ -2323,7 +2569,7 @@
           <w:i w:val="0"/>
           <w:sz w:val="22"/>
         </w:rPr>
-        <w:t>Onboarding is four steps. Each step saves to localStorage as you type or change a control, so Back and Continue keep your draft. Reset Demo Data clears the draft.</w:t>
+        <w:t>Onboarding is four steps. Each step saves a draft to localStorage as you type or change a control, so Back and Continue keep your place. Create Franchisee on step 4 writes the finished client into the Clients list. Reset Demo Data clears the draft and removes registered clients.</w:t>
       </w:r>
     </w:p>
     <w:tbl>
@@ -2703,7 +2949,7 @@
                 <w:color w:val="0F172A"/>
                 <w:sz w:val="18"/>
               </w:rPr>
-              <w:t>Read-only summary, then Create Franchisee</w:t>
+              <w:t>Read-only summary, then Create Franchisee writes the client to the Clients list</w:t>
             </w:r>
           </w:p>
         </w:tc>
@@ -2764,7 +3010,7 @@
         <w:drawing>
           <wp:inline xmlns:a="http://schemas.openxmlformats.org/drawingml/2006/main" xmlns:pic="http://schemas.openxmlformats.org/drawingml/2006/picture">
             <wp:extent cx="5760720" cy="6436804"/>
-            <wp:docPr id="6" name="Picture 6"/>
+            <wp:docPr id="7" name="Picture 7"/>
             <wp:cNvGraphicFramePr>
               <a:graphicFrameLocks noChangeAspect="1"/>
             </wp:cNvGraphicFramePr>
@@ -2776,7 +3022,7 @@
                     <pic:cNvPicPr/>
                   </pic:nvPicPr>
                   <pic:blipFill>
-                    <a:blip r:embed="rId14"/>
+                    <a:blip r:embed="rId15"/>
                     <a:stretch>
                       <a:fillRect/>
                     </a:stretch>
@@ -3239,7 +3485,7 @@
         <w:drawing>
           <wp:inline xmlns:a="http://schemas.openxmlformats.org/drawingml/2006/main" xmlns:pic="http://schemas.openxmlformats.org/drawingml/2006/picture">
             <wp:extent cx="5760720" cy="10417302"/>
-            <wp:docPr id="7" name="Picture 7"/>
+            <wp:docPr id="8" name="Picture 8"/>
             <wp:cNvGraphicFramePr>
               <a:graphicFrameLocks noChangeAspect="1"/>
             </wp:cNvGraphicFramePr>
@@ -3251,7 +3497,7 @@
                     <pic:cNvPicPr/>
                   </pic:nvPicPr>
                   <pic:blipFill>
-                    <a:blip r:embed="rId15"/>
+                    <a:blip r:embed="rId16"/>
                     <a:stretch>
                       <a:fillRect/>
                     </a:stretch>
@@ -3582,7 +3828,7 @@
         <w:drawing>
           <wp:inline xmlns:a="http://schemas.openxmlformats.org/drawingml/2006/main" xmlns:pic="http://schemas.openxmlformats.org/drawingml/2006/picture">
             <wp:extent cx="5760720" cy="3600450"/>
-            <wp:docPr id="8" name="Picture 8"/>
+            <wp:docPr id="9" name="Picture 9"/>
             <wp:cNvGraphicFramePr>
               <a:graphicFrameLocks noChangeAspect="1"/>
             </wp:cNvGraphicFramePr>
@@ -3594,7 +3840,7 @@
                     <pic:cNvPicPr/>
                   </pic:nvPicPr>
                   <pic:blipFill>
-                    <a:blip r:embed="rId16"/>
+                    <a:blip r:embed="rId17"/>
                     <a:stretch>
                       <a:fillRect/>
                     </a:stretch>
@@ -3983,7 +4229,7 @@
         <w:drawing>
           <wp:inline xmlns:a="http://schemas.openxmlformats.org/drawingml/2006/main" xmlns:pic="http://schemas.openxmlformats.org/drawingml/2006/picture">
             <wp:extent cx="5760720" cy="8645080"/>
-            <wp:docPr id="9" name="Picture 9"/>
+            <wp:docPr id="10" name="Picture 10"/>
             <wp:cNvGraphicFramePr>
               <a:graphicFrameLocks noChangeAspect="1"/>
             </wp:cNvGraphicFramePr>
@@ -3995,7 +4241,7 @@
                     <pic:cNvPicPr/>
                   </pic:nvPicPr>
                   <pic:blipFill>
-                    <a:blip r:embed="rId17"/>
+                    <a:blip r:embed="rId18"/>
                     <a:stretch>
                       <a:fillRect/>
                     </a:stretch>
@@ -4131,7 +4377,145 @@
           <w:color w:val="0F172A"/>
           <w:sz w:val="22"/>
         </w:rPr>
-        <w:t>On success the button becomes Franchisee created and a green note appears.</w:t>
+        <w:t>The app opens Clients. Your new row is at the top as Pending Review.</w:t>
+      </w:r>
+    </w:p>
+    <w:p>
+      <w:pPr>
+        <w:spacing w:after="80" w:before="0"/>
+        <w:ind w:left="227"/>
+      </w:pPr>
+      <w:r>
+        <w:rPr>
+          <w:rFonts w:ascii="Calibri" w:hAnsi="Calibri" w:eastAsia="Calibri"/>
+          <w:b/>
+          <w:i w:val="0"/>
+          <w:color w:val="1D4ED8"/>
+          <w:sz w:val="22"/>
+        </w:rPr>
+        <w:t xml:space="preserve">5.  </w:t>
+      </w:r>
+      <w:r>
+        <w:rPr>
+          <w:rFonts w:ascii="Calibri" w:hAnsi="Calibri" w:eastAsia="Calibri"/>
+          <w:b w:val="0"/>
+          <w:i w:val="0"/>
+          <w:color w:val="0F172A"/>
+          <w:sz w:val="22"/>
+        </w:rPr>
+        <w:t>Click View on that row to confirm Company Profile and the rest of the setup.</w:t>
+      </w:r>
+    </w:p>
+    <w:p>
+      <w:pPr>
+        <w:spacing w:before="120" w:after="40"/>
+        <w:jc w:val="center"/>
+      </w:pPr>
+      <w:r>
+        <w:drawing>
+          <wp:inline xmlns:a="http://schemas.openxmlformats.org/drawingml/2006/main" xmlns:pic="http://schemas.openxmlformats.org/drawingml/2006/picture">
+            <wp:extent cx="5760720" cy="3600450"/>
+            <wp:docPr id="11" name="Picture 11"/>
+            <wp:cNvGraphicFramePr>
+              <a:graphicFrameLocks noChangeAspect="1"/>
+            </wp:cNvGraphicFramePr>
+            <a:graphic>
+              <a:graphicData uri="http://schemas.openxmlformats.org/drawingml/2006/picture">
+                <pic:pic>
+                  <pic:nvPicPr>
+                    <pic:cNvPr id="0" name="admin-04-clients.png"/>
+                    <pic:cNvPicPr/>
+                  </pic:nvPicPr>
+                  <pic:blipFill>
+                    <a:blip r:embed="rId12"/>
+                    <a:stretch>
+                      <a:fillRect/>
+                    </a:stretch>
+                  </pic:blipFill>
+                  <pic:spPr>
+                    <a:xfrm>
+                      <a:off x="0" y="0"/>
+                      <a:ext cx="5760720" cy="3600450"/>
+                    </a:xfrm>
+                    <a:prstGeom prst="rect"/>
+                  </pic:spPr>
+                </pic:pic>
+              </a:graphicData>
+            </a:graphic>
+          </wp:inline>
+        </w:drawing>
+      </w:r>
+    </w:p>
+    <w:p>
+      <w:pPr>
+        <w:spacing w:after="240"/>
+        <w:jc w:val="center"/>
+      </w:pPr>
+      <w:r>
+        <w:rPr>
+          <w:rFonts w:ascii="Calibri" w:hAnsi="Calibri" w:eastAsia="Calibri"/>
+          <w:b w:val="0"/>
+          <w:i/>
+          <w:color w:val="475569"/>
+          <w:sz w:val="18"/>
+        </w:rPr>
+        <w:t>Clients list after Create Franchisee — the new company is first, Pending Review.</w:t>
+      </w:r>
+    </w:p>
+    <w:p>
+      <w:pPr>
+        <w:spacing w:before="120" w:after="40"/>
+        <w:jc w:val="center"/>
+      </w:pPr>
+      <w:r>
+        <w:drawing>
+          <wp:inline xmlns:a="http://schemas.openxmlformats.org/drawingml/2006/main" xmlns:pic="http://schemas.openxmlformats.org/drawingml/2006/picture">
+            <wp:extent cx="5760720" cy="6180772"/>
+            <wp:docPr id="12" name="Picture 12"/>
+            <wp:cNvGraphicFramePr>
+              <a:graphicFrameLocks noChangeAspect="1"/>
+            </wp:cNvGraphicFramePr>
+            <a:graphic>
+              <a:graphicData uri="http://schemas.openxmlformats.org/drawingml/2006/picture">
+                <pic:pic>
+                  <pic:nvPicPr>
+                    <pic:cNvPr id="0" name="admin-12-registered-client-detail.png"/>
+                    <pic:cNvPicPr/>
+                  </pic:nvPicPr>
+                  <pic:blipFill>
+                    <a:blip r:embed="rId19"/>
+                    <a:stretch>
+                      <a:fillRect/>
+                    </a:stretch>
+                  </pic:blipFill>
+                  <pic:spPr>
+                    <a:xfrm>
+                      <a:off x="0" y="0"/>
+                      <a:ext cx="5760720" cy="6180772"/>
+                    </a:xfrm>
+                    <a:prstGeom prst="rect"/>
+                  </pic:spPr>
+                </pic:pic>
+              </a:graphicData>
+            </a:graphic>
+          </wp:inline>
+        </w:drawing>
+      </w:r>
+    </w:p>
+    <w:p>
+      <w:pPr>
+        <w:spacing w:after="240"/>
+        <w:jc w:val="center"/>
+      </w:pPr>
+      <w:r>
+        <w:rPr>
+          <w:rFonts w:ascii="Calibri" w:hAnsi="Calibri" w:eastAsia="Calibri"/>
+          <w:b w:val="0"/>
+          <w:i/>
+          <w:color w:val="475569"/>
+          <w:sz w:val="18"/>
+        </w:rPr>
+        <w:t>Client Details for a registered client — Company Profile from step 1.</w:t>
       </w:r>
     </w:p>
     <w:tbl>
@@ -4147,7 +4531,7 @@
         <w:tc>
           <w:tcPr>
             <w:tcW w:type="dxa" w:w="9792"/>
-            <w:shd w:fill="FEF3C7" w:val="clear"/>
+            <w:shd w:fill="ECFDF5" w:val="clear"/>
             <w:tcBorders>
               <w:top w:val="single" w:sz="4" w:space="0" w:color="C7D2FE"/>
               <w:left w:val="single" w:sz="4" w:space="0" w:color="C7D2FE"/>
@@ -4167,7 +4551,7 @@
                 <w:color w:val="1D4ED8"/>
                 <w:sz w:val="20"/>
               </w:rPr>
-              <w:t>Demo limit</w:t>
+              <w:t>What gets saved</w:t>
             </w:r>
           </w:p>
           <w:p>
@@ -4182,7 +4566,7 @@
                 <w:color w:val="0F172A"/>
                 <w:sz w:val="20"/>
               </w:rPr>
-              <w:t>Create Franchisee confirms the review in this session only. The new client is not written into the Clients list or the Financials Dashboard portfolio. Seeded clients stay as they are. Saving a new client into the live portfolio is not wired in this demo yet.</w:t>
+              <w:t>Create Franchisee writes the company record to this browser (esarisari_registered_clients) and opens Clients. Passwords are not stored. This does not create a sign-in account for the new client. Open View, then Activate Client, before Confirm Collection. Reset Demo Data removes registered clients, activation overlays, and the onboarding draft; seeded demo clients stay.</w:t>
             </w:r>
           </w:p>
         </w:tc>
@@ -4215,7 +4599,7 @@
         <w:drawing>
           <wp:inline xmlns:a="http://schemas.openxmlformats.org/drawingml/2006/main" xmlns:pic="http://schemas.openxmlformats.org/drawingml/2006/picture">
             <wp:extent cx="5760720" cy="3600450"/>
-            <wp:docPr id="10" name="Picture 10"/>
+            <wp:docPr id="13" name="Picture 13"/>
             <wp:cNvGraphicFramePr>
               <a:graphicFrameLocks noChangeAspect="1"/>
             </wp:cNvGraphicFramePr>
@@ -4227,7 +4611,7 @@
                     <pic:cNvPicPr/>
                   </pic:nvPicPr>
                   <pic:blipFill>
-                    <a:blip r:embed="rId18"/>
+                    <a:blip r:embed="rId20"/>
                     <a:stretch>
                       <a:fillRect/>
                     </a:stretch>
@@ -4300,7 +4684,7 @@
           <w:i w:val="0"/>
           <w:sz w:val="22"/>
         </w:rPr>
-        <w:t>Reset restores the seeded network, wallets, empty Internet Credits / sales history, the seeded client portfolio, and collection marks. It also clears the onboarding draft (client info, franchise setup, and revenue split).</w:t>
+        <w:t>Reset restores the seeded network, wallets, empty Internet Credits / sales history, the seeded client portfolio, and collection marks. It also removes clients you registered, clears activation overlays, and clears the onboarding draft (client info, franchise setup, and revenue split).</w:t>
       </w:r>
     </w:p>
     <w:p>
@@ -4429,7 +4813,7 @@
                 <w:color w:val="0F172A"/>
                 <w:sz w:val="20"/>
               </w:rPr>
-              <w:t>Reset before a live walkthrough so Dashboard collections and the onboarding draft match this guide. Do not reset mid-demo unless you intend to wipe the session.</w:t>
+              <w:t>Reset before a live walkthrough so Dashboard collections, the Clients list, and the onboarding draft match this guide. Do not reset mid-demo unless you intend to wipe the session — including any clients you just registered.</w:t>
             </w:r>
           </w:p>
         </w:tc>
@@ -4650,7 +5034,7 @@
                 <w:color w:val="0F172A"/>
                 <w:sz w:val="18"/>
               </w:rPr>
-              <w:t>Client is live. Dashboard and Client Details can Confirm Collection.</w:t>
+              <w:t>Client is live. Dashboard and Client Details can Confirm Collection. Use Activate Client on Client Details to get here.</w:t>
             </w:r>
           </w:p>
         </w:tc>
@@ -5049,7 +5433,7 @@
           <w:color w:val="0F172A"/>
           <w:sz w:val="22"/>
         </w:rPr>
-        <w:t>Expecting Confirm Collection on a non-Activated client — only Activated rows can be collected.</w:t>
+        <w:t>Looking for franchise collections on Transactions, Revenue, or Reports — those pages are Internet Credits and sales only. Use Financials Dashboard or Clients.</w:t>
       </w:r>
     </w:p>
     <w:p>
@@ -5075,7 +5459,59 @@
           <w:color w:val="0F172A"/>
           <w:sz w:val="22"/>
         </w:rPr>
-        <w:t>Treating Create Franchisee as a new row on Clients — the demo confirms the review only; the portfolio stays seeded.</w:t>
+        <w:t>Expecting Confirm Collection on a non-Activated client — open Client Details and click Activate Client first.</w:t>
+      </w:r>
+    </w:p>
+    <w:p>
+      <w:pPr>
+        <w:spacing w:after="60"/>
+        <w:ind w:left="227"/>
+      </w:pPr>
+      <w:r>
+        <w:rPr>
+          <w:rFonts w:ascii="Calibri" w:hAnsi="Calibri" w:eastAsia="Calibri"/>
+          <w:b w:val="0"/>
+          <w:i w:val="0"/>
+          <w:color w:val="1D4ED8"/>
+          <w:sz w:val="22"/>
+        </w:rPr>
+        <w:t xml:space="preserve">•  </w:t>
+      </w:r>
+      <w:r>
+        <w:rPr>
+          <w:rFonts w:ascii="Calibri" w:hAnsi="Calibri" w:eastAsia="Calibri"/>
+          <w:b w:val="0"/>
+          <w:i w:val="0"/>
+          <w:color w:val="0F172A"/>
+          <w:sz w:val="22"/>
+        </w:rPr>
+        <w:t>Treating Create Franchisee as a login for the new client — the company appears on Clients, but this demo does not create a sign-in account.</w:t>
+      </w:r>
+    </w:p>
+    <w:p>
+      <w:pPr>
+        <w:spacing w:after="60"/>
+        <w:ind w:left="227"/>
+      </w:pPr>
+      <w:r>
+        <w:rPr>
+          <w:rFonts w:ascii="Calibri" w:hAnsi="Calibri" w:eastAsia="Calibri"/>
+          <w:b w:val="0"/>
+          <w:i w:val="0"/>
+          <w:color w:val="1D4ED8"/>
+          <w:sz w:val="22"/>
+        </w:rPr>
+        <w:t xml:space="preserve">•  </w:t>
+      </w:r>
+      <w:r>
+        <w:rPr>
+          <w:rFonts w:ascii="Calibri" w:hAnsi="Calibri" w:eastAsia="Calibri"/>
+          <w:b w:val="0"/>
+          <w:i w:val="0"/>
+          <w:color w:val="0F172A"/>
+          <w:sz w:val="22"/>
+        </w:rPr>
+        <w:t>Expecting the new client to stay off the Clients list — Create Franchisee now saves it and shows it at the top as Pending Review.</w:t>
       </w:r>
     </w:p>
     <w:p>
@@ -5153,7 +5589,7 @@
           <w:color w:val="0F172A"/>
           <w:sz w:val="22"/>
         </w:rPr>
-        <w:t>Using Reset Demo Data during a live collection walkthrough — it wipes payment marks and the onboarding draft.</w:t>
+        <w:t>Using Reset Demo Data during a live collection walkthrough — it wipes payment marks, the onboarding draft, registered clients, and activation overlays.</w:t>
       </w:r>
     </w:p>
     <w:p>

</xml_diff>

<commit_message>
Add Admin franchise collections on Transactions, Revenue, and Reports.
Keep Internet Credits and sales as a separate stream while reading and writing the same collection ledger as Dashboard and Client Details.

Co-authored-by: Cursor <cursoragent@cursor.com>
</commit_message>
<xml_diff>
--- a/docs/admin-user-guide.docx
+++ b/docs/admin-user-guide.docx
@@ -89,7 +89,7 @@
           <w:color w:val="475569"/>
           <w:sz w:val="20"/>
         </w:rPr>
-        <w:t>24 August 2026  ·  Demo environment</w:t>
+        <w:t>1 September 2026  ·  Demo environment</w:t>
       </w:r>
     </w:p>
     <w:tbl>
@@ -385,6 +385,56 @@
                 <w:sz w:val="18"/>
               </w:rPr>
               <w:t>Sub-Franchisee, Franchisee, and Retailer day-to-day screens</w:t>
+            </w:r>
+          </w:p>
+        </w:tc>
+      </w:tr>
+      <w:tr>
+        <w:tc>
+          <w:tcPr>
+            <w:tcW w:type="dxa" w:w="4896"/>
+            <w:shd w:fill="FFFFFF" w:val="clear"/>
+            <w:tcBorders>
+              <w:top w:val="single" w:sz="4" w:space="0" w:color="E2E8F0"/>
+              <w:left w:val="single" w:sz="4" w:space="0" w:color="E2E8F0"/>
+              <w:bottom w:val="single" w:sz="4" w:space="0" w:color="E2E8F0"/>
+              <w:right w:val="single" w:sz="4" w:space="0" w:color="E2E8F0"/>
+            </w:tcBorders>
+          </w:tcPr>
+          <w:p>
+            <w:r>
+              <w:rPr>
+                <w:rFonts w:ascii="Calibri" w:hAnsi="Calibri" w:eastAsia="Calibri"/>
+                <w:b w:val="0"/>
+                <w:i w:val="0"/>
+                <w:color w:val="0F172A"/>
+                <w:sz w:val="18"/>
+              </w:rPr>
+              <w:t>Franchise collections on Transactions, Revenue, and Reports (Admin)</w:t>
+            </w:r>
+          </w:p>
+        </w:tc>
+        <w:tc>
+          <w:tcPr>
+            <w:tcW w:type="dxa" w:w="4896"/>
+            <w:shd w:fill="FFFFFF" w:val="clear"/>
+            <w:tcBorders>
+              <w:top w:val="single" w:sz="4" w:space="0" w:color="E2E8F0"/>
+              <w:left w:val="single" w:sz="4" w:space="0" w:color="E2E8F0"/>
+              <w:bottom w:val="single" w:sz="4" w:space="0" w:color="E2E8F0"/>
+              <w:right w:val="single" w:sz="4" w:space="0" w:color="E2E8F0"/>
+            </w:tcBorders>
+          </w:tcPr>
+          <w:p>
+            <w:r>
+              <w:rPr>
+                <w:rFonts w:ascii="Calibri" w:hAnsi="Calibri" w:eastAsia="Calibri"/>
+                <w:b w:val="0"/>
+                <w:i w:val="0"/>
+                <w:color w:val="0F172A"/>
+                <w:sz w:val="18"/>
+              </w:rPr>
+              <w:t>Mixing collection cash into Internet Credits + sales Total earnings</w:t>
             </w:r>
           </w:p>
         </w:tc>
@@ -1521,7 +1571,7 @@
                 <w:color w:val="1D4ED8"/>
                 <w:sz w:val="20"/>
               </w:rPr>
-              <w:t>Shared with Client Details</w:t>
+              <w:t>One collection ledger</w:t>
             </w:r>
           </w:p>
           <w:p>
@@ -1536,7 +1586,440 @@
                 <w:color w:val="0F172A"/>
                 <w:sz w:val="20"/>
               </w:rPr>
-              <w:t>Dashboard collection marks are stored in the same localStorage key as Client Details (esarisari_franchise_collections). Confirming a payment on one screen updates the other after a refresh or navigation.</w:t>
+              <w:t>Dashboard, Client Details, Transactions, Revenue, and Reports all read and write esarisari_franchise_collections. Confirm Collection on any of those Admin screens updates the others after navigation. Reset Demo Data clears the same ledger.</w:t>
+            </w:r>
+          </w:p>
+        </w:tc>
+      </w:tr>
+    </w:tbl>
+    <w:p>
+      <w:pPr>
+        <w:spacing w:after="160"/>
+      </w:pPr>
+    </w:p>
+    <w:p>
+      <w:pPr>
+        <w:pStyle w:val="Heading2"/>
+        <w:spacing w:before="320" w:after="160"/>
+      </w:pPr>
+      <w:r>
+        <w:rPr>
+          <w:rFonts w:ascii="Calibri" w:hAnsi="Calibri"/>
+          <w:color w:val="0F172A"/>
+        </w:rPr>
+        <w:t>3.3 Transactions, Revenue, and Reports</w:t>
+      </w:r>
+    </w:p>
+    <w:p>
+      <w:pPr>
+        <w:spacing w:after="160" w:before="0" w:line="276" w:lineRule="auto"/>
+      </w:pPr>
+      <w:r>
+        <w:rPr>
+          <w:rFonts w:ascii="Calibri" w:hAnsi="Calibri" w:eastAsia="Calibri"/>
+          <w:b w:val="0"/>
+          <w:i w:val="0"/>
+          <w:sz w:val="22"/>
+        </w:rPr>
+        <w:t>Admin can confirm the same franchise setup collections on Transactions, Revenue, and Reports. Those pages keep Internet Credits and sales as a separate stream. Collection cash is not added into Total earnings, and collection rows are not mixed into the sales table.</w:t>
+      </w:r>
+    </w:p>
+    <w:tbl>
+      <w:tblPr>
+        <w:tblW w:type="auto" w:w="0"/>
+        <w:jc w:val="center"/>
+        <w:tblLayout w:type="autofit"/>
+        <w:tblLook w:firstColumn="1" w:firstRow="1" w:lastColumn="0" w:lastRow="0" w:noHBand="0" w:noVBand="1" w:val="04A0"/>
+      </w:tblPr>
+      <w:tblGrid>
+        <w:gridCol w:w="4896"/>
+        <w:gridCol w:w="4896"/>
+      </w:tblGrid>
+      <w:tr>
+        <w:tc>
+          <w:tcPr>
+            <w:tcW w:type="dxa" w:w="4896"/>
+            <w:shd w:fill="0F172A" w:val="clear"/>
+            <w:tcBorders>
+              <w:top w:val="single" w:sz="4" w:space="0" w:color="0F172A"/>
+              <w:left w:val="single" w:sz="4" w:space="0" w:color="0F172A"/>
+              <w:bottom w:val="single" w:sz="4" w:space="0" w:color="0F172A"/>
+              <w:right w:val="single" w:sz="4" w:space="0" w:color="0F172A"/>
+            </w:tcBorders>
+          </w:tcPr>
+          <w:p>
+            <w:r>
+              <w:rPr>
+                <w:rFonts w:ascii="Calibri" w:hAnsi="Calibri" w:eastAsia="Calibri"/>
+                <w:b/>
+                <w:i w:val="0"/>
+                <w:color w:val="FFFFFF"/>
+                <w:sz w:val="18"/>
+              </w:rPr>
+              <w:t>Page</w:t>
+            </w:r>
+          </w:p>
+        </w:tc>
+        <w:tc>
+          <w:tcPr>
+            <w:tcW w:type="dxa" w:w="4896"/>
+            <w:shd w:fill="0F172A" w:val="clear"/>
+            <w:tcBorders>
+              <w:top w:val="single" w:sz="4" w:space="0" w:color="0F172A"/>
+              <w:left w:val="single" w:sz="4" w:space="0" w:color="0F172A"/>
+              <w:bottom w:val="single" w:sz="4" w:space="0" w:color="0F172A"/>
+              <w:right w:val="single" w:sz="4" w:space="0" w:color="0F172A"/>
+            </w:tcBorders>
+          </w:tcPr>
+          <w:p>
+            <w:r>
+              <w:rPr>
+                <w:rFonts w:ascii="Calibri" w:hAnsi="Calibri" w:eastAsia="Calibri"/>
+                <w:b/>
+                <w:i w:val="0"/>
+                <w:color w:val="FFFFFF"/>
+                <w:sz w:val="18"/>
+              </w:rPr>
+              <w:t>What Admin sees</w:t>
+            </w:r>
+          </w:p>
+        </w:tc>
+      </w:tr>
+      <w:tr>
+        <w:tc>
+          <w:tcPr>
+            <w:tcW w:type="dxa" w:w="4896"/>
+            <w:shd w:fill="F8FAFC" w:val="clear"/>
+            <w:tcBorders>
+              <w:top w:val="single" w:sz="4" w:space="0" w:color="E2E8F0"/>
+              <w:left w:val="single" w:sz="4" w:space="0" w:color="E2E8F0"/>
+              <w:bottom w:val="single" w:sz="4" w:space="0" w:color="E2E8F0"/>
+              <w:right w:val="single" w:sz="4" w:space="0" w:color="E2E8F0"/>
+            </w:tcBorders>
+          </w:tcPr>
+          <w:p>
+            <w:r>
+              <w:rPr>
+                <w:rFonts w:ascii="Calibri" w:hAnsi="Calibri" w:eastAsia="Calibri"/>
+                <w:b w:val="0"/>
+                <w:i w:val="0"/>
+                <w:color w:val="0F172A"/>
+                <w:sz w:val="18"/>
+              </w:rPr>
+              <w:t>Transactions</w:t>
+            </w:r>
+          </w:p>
+        </w:tc>
+        <w:tc>
+          <w:tcPr>
+            <w:tcW w:type="dxa" w:w="4896"/>
+            <w:shd w:fill="F8FAFC" w:val="clear"/>
+            <w:tcBorders>
+              <w:top w:val="single" w:sz="4" w:space="0" w:color="E2E8F0"/>
+              <w:left w:val="single" w:sz="4" w:space="0" w:color="E2E8F0"/>
+              <w:bottom w:val="single" w:sz="4" w:space="0" w:color="E2E8F0"/>
+              <w:right w:val="single" w:sz="4" w:space="0" w:color="E2E8F0"/>
+            </w:tcBorders>
+          </w:tcPr>
+          <w:p>
+            <w:r>
+              <w:rPr>
+                <w:rFonts w:ascii="Calibri" w:hAnsi="Calibri" w:eastAsia="Calibri"/>
+                <w:b w:val="0"/>
+                <w:i w:val="0"/>
+                <w:color w:val="0F172A"/>
+                <w:sz w:val="18"/>
+              </w:rPr>
+              <w:t>Franchise Setup Collections card above the sales table. Shares the page date range. Confirm Collection on unpaid or partial rows.</w:t>
+            </w:r>
+          </w:p>
+        </w:tc>
+      </w:tr>
+      <w:tr>
+        <w:tc>
+          <w:tcPr>
+            <w:tcW w:type="dxa" w:w="4896"/>
+            <w:shd w:fill="FFFFFF" w:val="clear"/>
+            <w:tcBorders>
+              <w:top w:val="single" w:sz="4" w:space="0" w:color="E2E8F0"/>
+              <w:left w:val="single" w:sz="4" w:space="0" w:color="E2E8F0"/>
+              <w:bottom w:val="single" w:sz="4" w:space="0" w:color="E2E8F0"/>
+              <w:right w:val="single" w:sz="4" w:space="0" w:color="E2E8F0"/>
+            </w:tcBorders>
+          </w:tcPr>
+          <w:p>
+            <w:r>
+              <w:rPr>
+                <w:rFonts w:ascii="Calibri" w:hAnsi="Calibri" w:eastAsia="Calibri"/>
+                <w:b w:val="0"/>
+                <w:i w:val="0"/>
+                <w:color w:val="0F172A"/>
+                <w:sz w:val="18"/>
+              </w:rPr>
+              <w:t>Revenue</w:t>
+            </w:r>
+          </w:p>
+        </w:tc>
+        <w:tc>
+          <w:tcPr>
+            <w:tcW w:type="dxa" w:w="4896"/>
+            <w:shd w:fill="FFFFFF" w:val="clear"/>
+            <w:tcBorders>
+              <w:top w:val="single" w:sz="4" w:space="0" w:color="E2E8F0"/>
+              <w:left w:val="single" w:sz="4" w:space="0" w:color="E2E8F0"/>
+              <w:bottom w:val="single" w:sz="4" w:space="0" w:color="E2E8F0"/>
+              <w:right w:val="single" w:sz="4" w:space="0" w:color="E2E8F0"/>
+            </w:tcBorders>
+          </w:tcPr>
+          <w:p>
+            <w:r>
+              <w:rPr>
+                <w:rFonts w:ascii="Calibri" w:hAnsi="Calibri" w:eastAsia="Calibri"/>
+                <w:b w:val="0"/>
+                <w:i w:val="0"/>
+                <w:color w:val="0F172A"/>
+                <w:sz w:val="18"/>
+              </w:rPr>
+              <w:t>A fourth Franchise collections card (cash collected in the period) plus the same collections table. Internet Credits, Sales Commission, and Total earnings stay IC + sales only.</w:t>
+            </w:r>
+          </w:p>
+        </w:tc>
+      </w:tr>
+      <w:tr>
+        <w:tc>
+          <w:tcPr>
+            <w:tcW w:type="dxa" w:w="4896"/>
+            <w:shd w:fill="F8FAFC" w:val="clear"/>
+            <w:tcBorders>
+              <w:top w:val="single" w:sz="4" w:space="0" w:color="E2E8F0"/>
+              <w:left w:val="single" w:sz="4" w:space="0" w:color="E2E8F0"/>
+              <w:bottom w:val="single" w:sz="4" w:space="0" w:color="E2E8F0"/>
+              <w:right w:val="single" w:sz="4" w:space="0" w:color="E2E8F0"/>
+            </w:tcBorders>
+          </w:tcPr>
+          <w:p>
+            <w:r>
+              <w:rPr>
+                <w:rFonts w:ascii="Calibri" w:hAnsi="Calibri" w:eastAsia="Calibri"/>
+                <w:b w:val="0"/>
+                <w:i w:val="0"/>
+                <w:color w:val="0F172A"/>
+                <w:sz w:val="18"/>
+              </w:rPr>
+              <w:t>Reports</w:t>
+            </w:r>
+          </w:p>
+        </w:tc>
+        <w:tc>
+          <w:tcPr>
+            <w:tcW w:type="dxa" w:w="4896"/>
+            <w:shd w:fill="F8FAFC" w:val="clear"/>
+            <w:tcBorders>
+              <w:top w:val="single" w:sz="4" w:space="0" w:color="E2E8F0"/>
+              <w:left w:val="single" w:sz="4" w:space="0" w:color="E2E8F0"/>
+              <w:bottom w:val="single" w:sz="4" w:space="0" w:color="E2E8F0"/>
+              <w:right w:val="single" w:sz="4" w:space="0" w:color="E2E8F0"/>
+            </w:tcBorders>
+          </w:tcPr>
+          <w:p>
+            <w:r>
+              <w:rPr>
+                <w:rFonts w:ascii="Calibri" w:hAnsi="Calibri" w:eastAsia="Calibri"/>
+                <w:b w:val="0"/>
+                <w:i w:val="0"/>
+                <w:color w:val="0F172A"/>
+                <w:sz w:val="18"/>
+              </w:rPr>
+              <w:t>A Franchise collections hero card, Collections by client rollup, the same line-item table, and a Franchise collections CSV export.</w:t>
+            </w:r>
+          </w:p>
+        </w:tc>
+      </w:tr>
+    </w:tbl>
+    <w:p>
+      <w:pPr>
+        <w:spacing w:after="200"/>
+      </w:pPr>
+    </w:p>
+    <w:p>
+      <w:pPr>
+        <w:spacing w:after="80" w:before="0"/>
+        <w:ind w:left="227"/>
+      </w:pPr>
+      <w:r>
+        <w:rPr>
+          <w:rFonts w:ascii="Calibri" w:hAnsi="Calibri" w:eastAsia="Calibri"/>
+          <w:b/>
+          <w:i w:val="0"/>
+          <w:color w:val="1D4ED8"/>
+          <w:sz w:val="22"/>
+        </w:rPr>
+        <w:t xml:space="preserve">1.  </w:t>
+      </w:r>
+      <w:r>
+        <w:rPr>
+          <w:rFonts w:ascii="Calibri" w:hAnsi="Calibri" w:eastAsia="Calibri"/>
+          <w:b w:val="0"/>
+          <w:i w:val="0"/>
+          <w:color w:val="0F172A"/>
+          <w:sz w:val="22"/>
+        </w:rPr>
+        <w:t>Confirm a partial upfront or monthly amount on Financials Dashboard.</w:t>
+      </w:r>
+    </w:p>
+    <w:p>
+      <w:pPr>
+        <w:spacing w:after="80" w:before="0"/>
+        <w:ind w:left="227"/>
+      </w:pPr>
+      <w:r>
+        <w:rPr>
+          <w:rFonts w:ascii="Calibri" w:hAnsi="Calibri" w:eastAsia="Calibri"/>
+          <w:b/>
+          <w:i w:val="0"/>
+          <w:color w:val="1D4ED8"/>
+          <w:sz w:val="22"/>
+        </w:rPr>
+        <w:t xml:space="preserve">2.  </w:t>
+      </w:r>
+      <w:r>
+        <w:rPr>
+          <w:rFonts w:ascii="Calibri" w:hAnsi="Calibri" w:eastAsia="Calibri"/>
+          <w:b w:val="0"/>
+          <w:i w:val="0"/>
+          <w:color w:val="0F172A"/>
+          <w:sz w:val="22"/>
+        </w:rPr>
+        <w:t>Open Client Details — paid and remaining match.</w:t>
+      </w:r>
+    </w:p>
+    <w:p>
+      <w:pPr>
+        <w:spacing w:after="80" w:before="0"/>
+        <w:ind w:left="227"/>
+      </w:pPr>
+      <w:r>
+        <w:rPr>
+          <w:rFonts w:ascii="Calibri" w:hAnsi="Calibri" w:eastAsia="Calibri"/>
+          <w:b/>
+          <w:i w:val="0"/>
+          <w:color w:val="1D4ED8"/>
+          <w:sz w:val="22"/>
+        </w:rPr>
+        <w:t xml:space="preserve">3.  </w:t>
+      </w:r>
+      <w:r>
+        <w:rPr>
+          <w:rFonts w:ascii="Calibri" w:hAnsi="Calibri" w:eastAsia="Calibri"/>
+          <w:b w:val="0"/>
+          <w:i w:val="0"/>
+          <w:color w:val="0F172A"/>
+          <w:sz w:val="22"/>
+        </w:rPr>
+        <w:t>Open Transactions, Revenue, or Reports (Admin). Choose All Time or a range that includes the payment date / month.</w:t>
+      </w:r>
+    </w:p>
+    <w:p>
+      <w:pPr>
+        <w:spacing w:after="80" w:before="0"/>
+        <w:ind w:left="227"/>
+      </w:pPr>
+      <w:r>
+        <w:rPr>
+          <w:rFonts w:ascii="Calibri" w:hAnsi="Calibri" w:eastAsia="Calibri"/>
+          <w:b/>
+          <w:i w:val="0"/>
+          <w:color w:val="1D4ED8"/>
+          <w:sz w:val="22"/>
+        </w:rPr>
+        <w:t xml:space="preserve">4.  </w:t>
+      </w:r>
+      <w:r>
+        <w:rPr>
+          <w:rFonts w:ascii="Calibri" w:hAnsi="Calibri" w:eastAsia="Calibri"/>
+          <w:b w:val="0"/>
+          <w:i w:val="0"/>
+          <w:color w:val="0F172A"/>
+          <w:sz w:val="22"/>
+        </w:rPr>
+        <w:t>Confirm the remainder from Revenue (or Transactions / Reports). Enter an amount and a reference number.</w:t>
+      </w:r>
+    </w:p>
+    <w:p>
+      <w:pPr>
+        <w:spacing w:after="80" w:before="0"/>
+        <w:ind w:left="227"/>
+      </w:pPr>
+      <w:r>
+        <w:rPr>
+          <w:rFonts w:ascii="Calibri" w:hAnsi="Calibri" w:eastAsia="Calibri"/>
+          <w:b/>
+          <w:i w:val="0"/>
+          <w:color w:val="1D4ED8"/>
+          <w:sz w:val="22"/>
+        </w:rPr>
+        <w:t xml:space="preserve">5.  </w:t>
+      </w:r>
+      <w:r>
+        <w:rPr>
+          <w:rFonts w:ascii="Calibri" w:hAnsi="Calibri" w:eastAsia="Calibri"/>
+          <w:b w:val="0"/>
+          <w:i w:val="0"/>
+          <w:color w:val="0F172A"/>
+          <w:sz w:val="22"/>
+        </w:rPr>
+        <w:t>Return to Dashboard and Client Details. The same paid / remaining values appear without a second write path.</w:t>
+      </w:r>
+    </w:p>
+    <w:tbl>
+      <w:tblPr>
+        <w:tblW w:type="auto" w:w="0"/>
+        <w:jc w:val="center"/>
+        <w:tblLook w:firstColumn="1" w:firstRow="1" w:lastColumn="0" w:lastRow="0" w:noHBand="0" w:noVBand="1" w:val="04A0"/>
+      </w:tblPr>
+      <w:tblGrid>
+        <w:gridCol w:w="9792"/>
+      </w:tblGrid>
+      <w:tr>
+        <w:tc>
+          <w:tcPr>
+            <w:tcW w:type="dxa" w:w="9792"/>
+            <w:shd w:fill="ECFDF5" w:val="clear"/>
+            <w:tcBorders>
+              <w:top w:val="single" w:sz="4" w:space="0" w:color="C7D2FE"/>
+              <w:left w:val="single" w:sz="4" w:space="0" w:color="C7D2FE"/>
+              <w:bottom w:val="single" w:sz="4" w:space="0" w:color="C7D2FE"/>
+              <w:right w:val="single" w:sz="4" w:space="0" w:color="C7D2FE"/>
+            </w:tcBorders>
+          </w:tcPr>
+          <w:p>
+            <w:pPr>
+              <w:spacing w:after="40"/>
+            </w:pPr>
+            <w:r>
+              <w:rPr>
+                <w:rFonts w:ascii="Calibri" w:hAnsi="Calibri" w:eastAsia="Calibri"/>
+                <w:b/>
+                <w:i w:val="0"/>
+                <w:color w:val="1D4ED8"/>
+                <w:sz w:val="20"/>
+              </w:rPr>
+              <w:t>What is included</w:t>
+            </w:r>
+          </w:p>
+          <w:p>
+            <w:pPr>
+              <w:spacing w:after="40"/>
+            </w:pPr>
+            <w:r>
+              <w:rPr>
+                <w:rFonts w:ascii="Calibri" w:hAnsi="Calibri" w:eastAsia="Calibri"/>
+                <w:b w:val="0"/>
+                <w:i w:val="0"/>
+                <w:color w:val="0F172A"/>
+                <w:sz w:val="20"/>
+              </w:rPr>
+              <w:t>Activated clients only. Upfront = package fees + enabled one-time fees. Billable monthly = fixed monthly fees that are not cost deductions. Company vs client % is informational on the table. % of gross sales, cost-deduction-only fees, and Client Details demo Gross Sale / Cost Deduction / Revenue Share Payout rows stay off these pages.</w:t>
             </w:r>
           </w:p>
         </w:tc>
@@ -2427,7 +2910,7 @@
           <w:color w:val="0F172A"/>
           <w:sz w:val="22"/>
         </w:rPr>
-        <w:t>Status becomes Activated. Financial History appears, and Confirm Collection is enabled on this page and on the Financials Dashboard.</w:t>
+        <w:t>Status becomes Activated. Financial History appears, and Confirm Collection is enabled on this page, the Financials Dashboard, and the Admin collections section on Transactions, Revenue, and Reports.</w:t>
       </w:r>
     </w:p>
     <w:p>
@@ -5034,7 +5517,7 @@
                 <w:color w:val="0F172A"/>
                 <w:sz w:val="18"/>
               </w:rPr>
-              <w:t>Client is live. Dashboard and Client Details can Confirm Collection. Use Activate Client on Client Details to get here.</w:t>
+              <w:t>Client is live. Dashboard, Client Details, and the Admin collections section on Transactions, Revenue, and Reports can Confirm Collection. Use Activate Client on Client Details to get here.</w:t>
             </w:r>
           </w:p>
         </w:tc>
@@ -5433,7 +5916,7 @@
           <w:color w:val="0F172A"/>
           <w:sz w:val="22"/>
         </w:rPr>
-        <w:t>Looking for franchise collections on Transactions, Revenue, or Reports — those pages are Internet Credits and sales only. Use Financials Dashboard or Clients.</w:t>
+        <w:t>Expecting franchise collections inside Total earnings or the sales table — those stay Internet Credits and sales. Admin collections are a separate section on Transactions, Revenue, and Reports.</w:t>
       </w:r>
     </w:p>
     <w:p>
@@ -5604,7 +6087,7 @@
           <w:color w:val="475569"/>
           <w:sz w:val="22"/>
         </w:rPr>
-        <w:t>This guide matches the eSariSari Admin module as of 24 August 2026. It does not replace the Internet Credits User Guide. Screenshots are layout references; live numbers depend on collections you confirm in this session.</w:t>
+        <w:t>This guide matches the eSariSari Admin module as of 1 September 2026. It does not replace the Internet Credits User Guide. Screenshots are layout references; live numbers depend on collections you confirm in this session.</w:t>
       </w:r>
     </w:p>
     <w:sectPr>

</xml_diff>

<commit_message>
Publish versioned user guides with recaptured screenshots.
User Guide is v2.0 and Admin User Guide is v1.1, with figures that match 100% credit burn, hidden Sale Margin, and Admin collections on Transactions, Revenue, and Reports.

Co-authored-by: Cursor <cursoragent@cursor.com>
</commit_message>
<xml_diff>
--- a/docs/admin-user-guide.docx
+++ b/docs/admin-user-guide.docx
@@ -89,7 +89,7 @@
           <w:color w:val="475569"/>
           <w:sz w:val="20"/>
         </w:rPr>
-        <w:t>1 September 2026  ·  Demo environment</w:t>
+        <w:t>Version 1.1  ·  2 September 2026  ·  Demo environment</w:t>
       </w:r>
     </w:p>
     <w:tbl>
@@ -125,7 +125,7 @@
                 <w:color w:val="1D4ED8"/>
                 <w:sz w:val="20"/>
               </w:rPr>
-              <w:t>About this demo</w:t>
+              <w:t>About this demo (version 1.1)</w:t>
             </w:r>
           </w:p>
           <w:p>
@@ -149,6 +149,273 @@
     <w:p>
       <w:pPr>
         <w:spacing w:after="160"/>
+      </w:pPr>
+    </w:p>
+    <w:p>
+      <w:pPr>
+        <w:pStyle w:val="Heading1"/>
+        <w:spacing w:before="160" w:after="160"/>
+      </w:pPr>
+      <w:r>
+        <w:rPr>
+          <w:rFonts w:ascii="Calibri" w:hAnsi="Calibri"/>
+          <w:color w:val="0F172A"/>
+        </w:rPr>
+        <w:t>What's new in this version</w:t>
+      </w:r>
+    </w:p>
+    <w:p>
+      <w:pPr>
+        <w:spacing w:after="160" w:before="0" w:line="276" w:lineRule="auto"/>
+      </w:pPr>
+      <w:r>
+        <w:rPr>
+          <w:rFonts w:ascii="Calibri" w:hAnsi="Calibri" w:eastAsia="Calibri"/>
+          <w:b w:val="0"/>
+          <w:i w:val="0"/>
+          <w:sz w:val="22"/>
+        </w:rPr>
+        <w:t>Version 1.1 matches the Admin module as of 2 September 2026.</w:t>
+      </w:r>
+    </w:p>
+    <w:tbl>
+      <w:tblPr>
+        <w:tblW w:type="auto" w:w="0"/>
+        <w:jc w:val="center"/>
+        <w:tblLayout w:type="autofit"/>
+        <w:tblLook w:firstColumn="1" w:firstRow="1" w:lastColumn="0" w:lastRow="0" w:noHBand="0" w:noVBand="1" w:val="04A0"/>
+      </w:tblPr>
+      <w:tblGrid>
+        <w:gridCol w:w="3264"/>
+        <w:gridCol w:w="3264"/>
+        <w:gridCol w:w="3264"/>
+      </w:tblGrid>
+      <w:tr>
+        <w:tc>
+          <w:tcPr>
+            <w:tcW w:type="dxa" w:w="3264"/>
+            <w:shd w:fill="0F172A" w:val="clear"/>
+            <w:tcBorders>
+              <w:top w:val="single" w:sz="4" w:space="0" w:color="0F172A"/>
+              <w:left w:val="single" w:sz="4" w:space="0" w:color="0F172A"/>
+              <w:bottom w:val="single" w:sz="4" w:space="0" w:color="0F172A"/>
+              <w:right w:val="single" w:sz="4" w:space="0" w:color="0F172A"/>
+            </w:tcBorders>
+          </w:tcPr>
+          <w:p>
+            <w:r>
+              <w:rPr>
+                <w:rFonts w:ascii="Calibri" w:hAnsi="Calibri" w:eastAsia="Calibri"/>
+                <w:b/>
+                <w:i w:val="0"/>
+                <w:color w:val="FFFFFF"/>
+                <w:sz w:val="18"/>
+              </w:rPr>
+              <w:t>Version</w:t>
+            </w:r>
+          </w:p>
+        </w:tc>
+        <w:tc>
+          <w:tcPr>
+            <w:tcW w:type="dxa" w:w="3264"/>
+            <w:shd w:fill="0F172A" w:val="clear"/>
+            <w:tcBorders>
+              <w:top w:val="single" w:sz="4" w:space="0" w:color="0F172A"/>
+              <w:left w:val="single" w:sz="4" w:space="0" w:color="0F172A"/>
+              <w:bottom w:val="single" w:sz="4" w:space="0" w:color="0F172A"/>
+              <w:right w:val="single" w:sz="4" w:space="0" w:color="0F172A"/>
+            </w:tcBorders>
+          </w:tcPr>
+          <w:p>
+            <w:r>
+              <w:rPr>
+                <w:rFonts w:ascii="Calibri" w:hAnsi="Calibri" w:eastAsia="Calibri"/>
+                <w:b/>
+                <w:i w:val="0"/>
+                <w:color w:val="FFFFFF"/>
+                <w:sz w:val="18"/>
+              </w:rPr>
+              <w:t>Date</w:t>
+            </w:r>
+          </w:p>
+        </w:tc>
+        <w:tc>
+          <w:tcPr>
+            <w:tcW w:type="dxa" w:w="3264"/>
+            <w:shd w:fill="0F172A" w:val="clear"/>
+            <w:tcBorders>
+              <w:top w:val="single" w:sz="4" w:space="0" w:color="0F172A"/>
+              <w:left w:val="single" w:sz="4" w:space="0" w:color="0F172A"/>
+              <w:bottom w:val="single" w:sz="4" w:space="0" w:color="0F172A"/>
+              <w:right w:val="single" w:sz="4" w:space="0" w:color="0F172A"/>
+            </w:tcBorders>
+          </w:tcPr>
+          <w:p>
+            <w:r>
+              <w:rPr>
+                <w:rFonts w:ascii="Calibri" w:hAnsi="Calibri" w:eastAsia="Calibri"/>
+                <w:b/>
+                <w:i w:val="0"/>
+                <w:color w:val="FFFFFF"/>
+                <w:sz w:val="18"/>
+              </w:rPr>
+              <w:t>What changed</w:t>
+            </w:r>
+          </w:p>
+        </w:tc>
+      </w:tr>
+      <w:tr>
+        <w:tc>
+          <w:tcPr>
+            <w:tcW w:type="dxa" w:w="3264"/>
+            <w:shd w:fill="F8FAFC" w:val="clear"/>
+            <w:tcBorders>
+              <w:top w:val="single" w:sz="4" w:space="0" w:color="E2E8F0"/>
+              <w:left w:val="single" w:sz="4" w:space="0" w:color="E2E8F0"/>
+              <w:bottom w:val="single" w:sz="4" w:space="0" w:color="E2E8F0"/>
+              <w:right w:val="single" w:sz="4" w:space="0" w:color="E2E8F0"/>
+            </w:tcBorders>
+          </w:tcPr>
+          <w:p>
+            <w:r>
+              <w:rPr>
+                <w:rFonts w:ascii="Calibri" w:hAnsi="Calibri" w:eastAsia="Calibri"/>
+                <w:b w:val="0"/>
+                <w:i w:val="0"/>
+                <w:color w:val="0F172A"/>
+                <w:sz w:val="18"/>
+              </w:rPr>
+              <w:t>1.1 (current)</w:t>
+            </w:r>
+          </w:p>
+        </w:tc>
+        <w:tc>
+          <w:tcPr>
+            <w:tcW w:type="dxa" w:w="3264"/>
+            <w:shd w:fill="F8FAFC" w:val="clear"/>
+            <w:tcBorders>
+              <w:top w:val="single" w:sz="4" w:space="0" w:color="E2E8F0"/>
+              <w:left w:val="single" w:sz="4" w:space="0" w:color="E2E8F0"/>
+              <w:bottom w:val="single" w:sz="4" w:space="0" w:color="E2E8F0"/>
+              <w:right w:val="single" w:sz="4" w:space="0" w:color="E2E8F0"/>
+            </w:tcBorders>
+          </w:tcPr>
+          <w:p>
+            <w:r>
+              <w:rPr>
+                <w:rFonts w:ascii="Calibri" w:hAnsi="Calibri" w:eastAsia="Calibri"/>
+                <w:b w:val="0"/>
+                <w:i w:val="0"/>
+                <w:color w:val="0F172A"/>
+                <w:sz w:val="18"/>
+              </w:rPr>
+              <w:t>2 September 2026</w:t>
+            </w:r>
+          </w:p>
+        </w:tc>
+        <w:tc>
+          <w:tcPr>
+            <w:tcW w:type="dxa" w:w="3264"/>
+            <w:shd w:fill="F8FAFC" w:val="clear"/>
+            <w:tcBorders>
+              <w:top w:val="single" w:sz="4" w:space="0" w:color="E2E8F0"/>
+              <w:left w:val="single" w:sz="4" w:space="0" w:color="E2E8F0"/>
+              <w:bottom w:val="single" w:sz="4" w:space="0" w:color="E2E8F0"/>
+              <w:right w:val="single" w:sz="4" w:space="0" w:color="E2E8F0"/>
+            </w:tcBorders>
+          </w:tcPr>
+          <w:p>
+            <w:r>
+              <w:rPr>
+                <w:rFonts w:ascii="Calibri" w:hAnsi="Calibri" w:eastAsia="Calibri"/>
+                <w:b w:val="0"/>
+                <w:i w:val="0"/>
+                <w:color w:val="0F172A"/>
+                <w:sz w:val="18"/>
+              </w:rPr>
+              <w:t>Confirm Collection on Transactions, Revenue, and Reports (same ledger as Dashboard and Client Details). Collection cash stays out of Total earnings.</w:t>
+            </w:r>
+          </w:p>
+        </w:tc>
+      </w:tr>
+      <w:tr>
+        <w:tc>
+          <w:tcPr>
+            <w:tcW w:type="dxa" w:w="3264"/>
+            <w:shd w:fill="FFFFFF" w:val="clear"/>
+            <w:tcBorders>
+              <w:top w:val="single" w:sz="4" w:space="0" w:color="E2E8F0"/>
+              <w:left w:val="single" w:sz="4" w:space="0" w:color="E2E8F0"/>
+              <w:bottom w:val="single" w:sz="4" w:space="0" w:color="E2E8F0"/>
+              <w:right w:val="single" w:sz="4" w:space="0" w:color="E2E8F0"/>
+            </w:tcBorders>
+          </w:tcPr>
+          <w:p>
+            <w:r>
+              <w:rPr>
+                <w:rFonts w:ascii="Calibri" w:hAnsi="Calibri" w:eastAsia="Calibri"/>
+                <w:b w:val="0"/>
+                <w:i w:val="0"/>
+                <w:color w:val="0F172A"/>
+                <w:sz w:val="18"/>
+              </w:rPr>
+              <w:t>1.0</w:t>
+            </w:r>
+          </w:p>
+        </w:tc>
+        <w:tc>
+          <w:tcPr>
+            <w:tcW w:type="dxa" w:w="3264"/>
+            <w:shd w:fill="FFFFFF" w:val="clear"/>
+            <w:tcBorders>
+              <w:top w:val="single" w:sz="4" w:space="0" w:color="E2E8F0"/>
+              <w:left w:val="single" w:sz="4" w:space="0" w:color="E2E8F0"/>
+              <w:bottom w:val="single" w:sz="4" w:space="0" w:color="E2E8F0"/>
+              <w:right w:val="single" w:sz="4" w:space="0" w:color="E2E8F0"/>
+            </w:tcBorders>
+          </w:tcPr>
+          <w:p>
+            <w:r>
+              <w:rPr>
+                <w:rFonts w:ascii="Calibri" w:hAnsi="Calibri" w:eastAsia="Calibri"/>
+                <w:b w:val="0"/>
+                <w:i w:val="0"/>
+                <w:color w:val="0F172A"/>
+                <w:sz w:val="18"/>
+              </w:rPr>
+              <w:t>1 September 2026</w:t>
+            </w:r>
+          </w:p>
+        </w:tc>
+        <w:tc>
+          <w:tcPr>
+            <w:tcW w:type="dxa" w:w="3264"/>
+            <w:shd w:fill="FFFFFF" w:val="clear"/>
+            <w:tcBorders>
+              <w:top w:val="single" w:sz="4" w:space="0" w:color="E2E8F0"/>
+              <w:left w:val="single" w:sz="4" w:space="0" w:color="E2E8F0"/>
+              <w:bottom w:val="single" w:sz="4" w:space="0" w:color="E2E8F0"/>
+              <w:right w:val="single" w:sz="4" w:space="0" w:color="E2E8F0"/>
+            </w:tcBorders>
+          </w:tcPr>
+          <w:p>
+            <w:r>
+              <w:rPr>
+                <w:rFonts w:ascii="Calibri" w:hAnsi="Calibri" w:eastAsia="Calibri"/>
+                <w:b w:val="0"/>
+                <w:i w:val="0"/>
+                <w:color w:val="0F172A"/>
+                <w:sz w:val="18"/>
+              </w:rPr>
+              <w:t>First Admin walkthrough: Financials Dashboard, Clients, onboarding wizard, Activate Client.</w:t>
+            </w:r>
+          </w:p>
+        </w:tc>
+      </w:tr>
+    </w:tbl>
+    <w:p>
+      <w:pPr>
+        <w:spacing w:after="200"/>
       </w:pPr>
     </w:p>
     <w:p>
@@ -1971,6 +2238,174 @@
         <w:t>Return to Dashboard and Client Details. The same paid / remaining values appear without a second write path.</w:t>
       </w:r>
     </w:p>
+    <w:p>
+      <w:pPr>
+        <w:spacing w:before="120" w:after="40"/>
+        <w:jc w:val="center"/>
+      </w:pPr>
+      <w:r>
+        <w:drawing>
+          <wp:inline xmlns:a="http://schemas.openxmlformats.org/drawingml/2006/main" xmlns:pic="http://schemas.openxmlformats.org/drawingml/2006/picture">
+            <wp:extent cx="5760720" cy="4592574"/>
+            <wp:docPr id="4" name="Picture 4"/>
+            <wp:cNvGraphicFramePr>
+              <a:graphicFrameLocks noChangeAspect="1"/>
+            </wp:cNvGraphicFramePr>
+            <a:graphic>
+              <a:graphicData uri="http://schemas.openxmlformats.org/drawingml/2006/picture">
+                <pic:pic>
+                  <pic:nvPicPr>
+                    <pic:cNvPr id="0" name="admin-14-transactions-collections.png"/>
+                    <pic:cNvPicPr/>
+                  </pic:nvPicPr>
+                  <pic:blipFill>
+                    <a:blip r:embed="rId12"/>
+                    <a:stretch>
+                      <a:fillRect/>
+                    </a:stretch>
+                  </pic:blipFill>
+                  <pic:spPr>
+                    <a:xfrm>
+                      <a:off x="0" y="0"/>
+                      <a:ext cx="5760720" cy="4592574"/>
+                    </a:xfrm>
+                    <a:prstGeom prst="rect"/>
+                  </pic:spPr>
+                </pic:pic>
+              </a:graphicData>
+            </a:graphic>
+          </wp:inline>
+        </w:drawing>
+      </w:r>
+    </w:p>
+    <w:p>
+      <w:pPr>
+        <w:spacing w:after="240"/>
+        <w:jc w:val="center"/>
+      </w:pPr>
+      <w:r>
+        <w:rPr>
+          <w:rFonts w:ascii="Calibri" w:hAnsi="Calibri" w:eastAsia="Calibri"/>
+          <w:b w:val="0"/>
+          <w:i/>
+          <w:color w:val="475569"/>
+          <w:sz w:val="18"/>
+        </w:rPr>
+        <w:t>Admin Transactions — Franchise Setup Collections sit above the sales table and share the page date range.</w:t>
+      </w:r>
+    </w:p>
+    <w:p>
+      <w:pPr>
+        <w:spacing w:before="120" w:after="40"/>
+        <w:jc w:val="center"/>
+      </w:pPr>
+      <w:r>
+        <w:drawing>
+          <wp:inline xmlns:a="http://schemas.openxmlformats.org/drawingml/2006/main" xmlns:pic="http://schemas.openxmlformats.org/drawingml/2006/picture">
+            <wp:extent cx="5760720" cy="5196650"/>
+            <wp:docPr id="5" name="Picture 5"/>
+            <wp:cNvGraphicFramePr>
+              <a:graphicFrameLocks noChangeAspect="1"/>
+            </wp:cNvGraphicFramePr>
+            <a:graphic>
+              <a:graphicData uri="http://schemas.openxmlformats.org/drawingml/2006/picture">
+                <pic:pic>
+                  <pic:nvPicPr>
+                    <pic:cNvPr id="0" name="admin-15-revenue-collections.png"/>
+                    <pic:cNvPicPr/>
+                  </pic:nvPicPr>
+                  <pic:blipFill>
+                    <a:blip r:embed="rId13"/>
+                    <a:stretch>
+                      <a:fillRect/>
+                    </a:stretch>
+                  </pic:blipFill>
+                  <pic:spPr>
+                    <a:xfrm>
+                      <a:off x="0" y="0"/>
+                      <a:ext cx="5760720" cy="5196650"/>
+                    </a:xfrm>
+                    <a:prstGeom prst="rect"/>
+                  </pic:spPr>
+                </pic:pic>
+              </a:graphicData>
+            </a:graphic>
+          </wp:inline>
+        </w:drawing>
+      </w:r>
+    </w:p>
+    <w:p>
+      <w:pPr>
+        <w:spacing w:after="240"/>
+        <w:jc w:val="center"/>
+      </w:pPr>
+      <w:r>
+        <w:rPr>
+          <w:rFonts w:ascii="Calibri" w:hAnsi="Calibri" w:eastAsia="Calibri"/>
+          <w:b w:val="0"/>
+          <w:i/>
+          <w:color w:val="475569"/>
+          <w:sz w:val="18"/>
+        </w:rPr>
+        <w:t>Admin Revenue — Franchise collections card plus the same collections table. Total earnings stays Internet Credits + sales.</w:t>
+      </w:r>
+    </w:p>
+    <w:p>
+      <w:pPr>
+        <w:spacing w:before="120" w:after="40"/>
+        <w:jc w:val="center"/>
+      </w:pPr>
+      <w:r>
+        <w:drawing>
+          <wp:inline xmlns:a="http://schemas.openxmlformats.org/drawingml/2006/main" xmlns:pic="http://schemas.openxmlformats.org/drawingml/2006/picture">
+            <wp:extent cx="5760720" cy="15565946"/>
+            <wp:docPr id="6" name="Picture 6"/>
+            <wp:cNvGraphicFramePr>
+              <a:graphicFrameLocks noChangeAspect="1"/>
+            </wp:cNvGraphicFramePr>
+            <a:graphic>
+              <a:graphicData uri="http://schemas.openxmlformats.org/drawingml/2006/picture">
+                <pic:pic>
+                  <pic:nvPicPr>
+                    <pic:cNvPr id="0" name="admin-16-reports-collections.png"/>
+                    <pic:cNvPicPr/>
+                  </pic:nvPicPr>
+                  <pic:blipFill>
+                    <a:blip r:embed="rId14"/>
+                    <a:stretch>
+                      <a:fillRect/>
+                    </a:stretch>
+                  </pic:blipFill>
+                  <pic:spPr>
+                    <a:xfrm>
+                      <a:off x="0" y="0"/>
+                      <a:ext cx="5760720" cy="15565946"/>
+                    </a:xfrm>
+                    <a:prstGeom prst="rect"/>
+                  </pic:spPr>
+                </pic:pic>
+              </a:graphicData>
+            </a:graphic>
+          </wp:inline>
+        </w:drawing>
+      </w:r>
+    </w:p>
+    <w:p>
+      <w:pPr>
+        <w:spacing w:after="240"/>
+        <w:jc w:val="center"/>
+      </w:pPr>
+      <w:r>
+        <w:rPr>
+          <w:rFonts w:ascii="Calibri" w:hAnsi="Calibri" w:eastAsia="Calibri"/>
+          <w:b w:val="0"/>
+          <w:i/>
+          <w:color w:val="475569"/>
+          <w:sz w:val="18"/>
+        </w:rPr>
+        <w:t>Admin Reports — Franchise collections hero card, Collections by client, and the Franchise collections CSV export.</w:t>
+      </w:r>
+    </w:p>
     <w:tbl>
       <w:tblPr>
         <w:tblW w:type="auto" w:w="0"/>
@@ -2066,7 +2501,7 @@
         <w:drawing>
           <wp:inline xmlns:a="http://schemas.openxmlformats.org/drawingml/2006/main" xmlns:pic="http://schemas.openxmlformats.org/drawingml/2006/picture">
             <wp:extent cx="5760720" cy="3600450"/>
-            <wp:docPr id="4" name="Picture 4"/>
+            <wp:docPr id="7" name="Picture 7"/>
             <wp:cNvGraphicFramePr>
               <a:graphicFrameLocks noChangeAspect="1"/>
             </wp:cNvGraphicFramePr>
@@ -2078,7 +2513,7 @@
                     <pic:cNvPicPr/>
                   </pic:nvPicPr>
                   <pic:blipFill>
-                    <a:blip r:embed="rId12"/>
+                    <a:blip r:embed="rId15"/>
                     <a:stretch>
                       <a:fillRect/>
                     </a:stretch>
@@ -2630,8 +3065,8 @@
       <w:r>
         <w:drawing>
           <wp:inline xmlns:a="http://schemas.openxmlformats.org/drawingml/2006/main" xmlns:pic="http://schemas.openxmlformats.org/drawingml/2006/picture">
-            <wp:extent cx="5760720" cy="7988998"/>
-            <wp:docPr id="5" name="Picture 5"/>
+            <wp:extent cx="5760720" cy="8345043"/>
+            <wp:docPr id="8" name="Picture 8"/>
             <wp:cNvGraphicFramePr>
               <a:graphicFrameLocks noChangeAspect="1"/>
             </wp:cNvGraphicFramePr>
@@ -2643,7 +3078,7 @@
                     <pic:cNvPicPr/>
                   </pic:nvPicPr>
                   <pic:blipFill>
-                    <a:blip r:embed="rId13"/>
+                    <a:blip r:embed="rId16"/>
                     <a:stretch>
                       <a:fillRect/>
                     </a:stretch>
@@ -2651,7 +3086,7 @@
                   <pic:spPr>
                     <a:xfrm>
                       <a:off x="0" y="0"/>
-                      <a:ext cx="5760720" cy="7988998"/>
+                      <a:ext cx="5760720" cy="8345043"/>
                     </a:xfrm>
                     <a:prstGeom prst="rect"/>
                   </pic:spPr>
@@ -2922,7 +3357,7 @@
         <w:drawing>
           <wp:inline xmlns:a="http://schemas.openxmlformats.org/drawingml/2006/main" xmlns:pic="http://schemas.openxmlformats.org/drawingml/2006/picture">
             <wp:extent cx="5760720" cy="3600450"/>
-            <wp:docPr id="6" name="Picture 6"/>
+            <wp:docPr id="9" name="Picture 9"/>
             <wp:cNvGraphicFramePr>
               <a:graphicFrameLocks noChangeAspect="1"/>
             </wp:cNvGraphicFramePr>
@@ -2934,7 +3369,7 @@
                     <pic:cNvPicPr/>
                   </pic:nvPicPr>
                   <pic:blipFill>
-                    <a:blip r:embed="rId14"/>
+                    <a:blip r:embed="rId17"/>
                     <a:stretch>
                       <a:fillRect/>
                     </a:stretch>
@@ -3493,7 +3928,7 @@
         <w:drawing>
           <wp:inline xmlns:a="http://schemas.openxmlformats.org/drawingml/2006/main" xmlns:pic="http://schemas.openxmlformats.org/drawingml/2006/picture">
             <wp:extent cx="5760720" cy="6436804"/>
-            <wp:docPr id="7" name="Picture 7"/>
+            <wp:docPr id="10" name="Picture 10"/>
             <wp:cNvGraphicFramePr>
               <a:graphicFrameLocks noChangeAspect="1"/>
             </wp:cNvGraphicFramePr>
@@ -3505,7 +3940,7 @@
                     <pic:cNvPicPr/>
                   </pic:nvPicPr>
                   <pic:blipFill>
-                    <a:blip r:embed="rId15"/>
+                    <a:blip r:embed="rId18"/>
                     <a:stretch>
                       <a:fillRect/>
                     </a:stretch>
@@ -3968,7 +4403,7 @@
         <w:drawing>
           <wp:inline xmlns:a="http://schemas.openxmlformats.org/drawingml/2006/main" xmlns:pic="http://schemas.openxmlformats.org/drawingml/2006/picture">
             <wp:extent cx="5760720" cy="10417302"/>
-            <wp:docPr id="8" name="Picture 8"/>
+            <wp:docPr id="11" name="Picture 11"/>
             <wp:cNvGraphicFramePr>
               <a:graphicFrameLocks noChangeAspect="1"/>
             </wp:cNvGraphicFramePr>
@@ -3980,7 +4415,7 @@
                     <pic:cNvPicPr/>
                   </pic:nvPicPr>
                   <pic:blipFill>
-                    <a:blip r:embed="rId16"/>
+                    <a:blip r:embed="rId19"/>
                     <a:stretch>
                       <a:fillRect/>
                     </a:stretch>
@@ -4311,7 +4746,7 @@
         <w:drawing>
           <wp:inline xmlns:a="http://schemas.openxmlformats.org/drawingml/2006/main" xmlns:pic="http://schemas.openxmlformats.org/drawingml/2006/picture">
             <wp:extent cx="5760720" cy="3600450"/>
-            <wp:docPr id="9" name="Picture 9"/>
+            <wp:docPr id="12" name="Picture 12"/>
             <wp:cNvGraphicFramePr>
               <a:graphicFrameLocks noChangeAspect="1"/>
             </wp:cNvGraphicFramePr>
@@ -4323,7 +4758,7 @@
                     <pic:cNvPicPr/>
                   </pic:nvPicPr>
                   <pic:blipFill>
-                    <a:blip r:embed="rId17"/>
+                    <a:blip r:embed="rId20"/>
                     <a:stretch>
                       <a:fillRect/>
                     </a:stretch>
@@ -4712,7 +5147,7 @@
         <w:drawing>
           <wp:inline xmlns:a="http://schemas.openxmlformats.org/drawingml/2006/main" xmlns:pic="http://schemas.openxmlformats.org/drawingml/2006/picture">
             <wp:extent cx="5760720" cy="8645080"/>
-            <wp:docPr id="10" name="Picture 10"/>
+            <wp:docPr id="13" name="Picture 13"/>
             <wp:cNvGraphicFramePr>
               <a:graphicFrameLocks noChangeAspect="1"/>
             </wp:cNvGraphicFramePr>
@@ -4724,7 +5159,7 @@
                     <pic:cNvPicPr/>
                   </pic:nvPicPr>
                   <pic:blipFill>
-                    <a:blip r:embed="rId18"/>
+                    <a:blip r:embed="rId21"/>
                     <a:stretch>
                       <a:fillRect/>
                     </a:stretch>
@@ -4898,7 +5333,7 @@
         <w:drawing>
           <wp:inline xmlns:a="http://schemas.openxmlformats.org/drawingml/2006/main" xmlns:pic="http://schemas.openxmlformats.org/drawingml/2006/picture">
             <wp:extent cx="5760720" cy="3600450"/>
-            <wp:docPr id="11" name="Picture 11"/>
+            <wp:docPr id="14" name="Picture 14"/>
             <wp:cNvGraphicFramePr>
               <a:graphicFrameLocks noChangeAspect="1"/>
             </wp:cNvGraphicFramePr>
@@ -4910,7 +5345,7 @@
                     <pic:cNvPicPr/>
                   </pic:nvPicPr>
                   <pic:blipFill>
-                    <a:blip r:embed="rId12"/>
+                    <a:blip r:embed="rId15"/>
                     <a:stretch>
                       <a:fillRect/>
                     </a:stretch>
@@ -4954,7 +5389,7 @@
         <w:drawing>
           <wp:inline xmlns:a="http://schemas.openxmlformats.org/drawingml/2006/main" xmlns:pic="http://schemas.openxmlformats.org/drawingml/2006/picture">
             <wp:extent cx="5760720" cy="6180772"/>
-            <wp:docPr id="12" name="Picture 12"/>
+            <wp:docPr id="15" name="Picture 15"/>
             <wp:cNvGraphicFramePr>
               <a:graphicFrameLocks noChangeAspect="1"/>
             </wp:cNvGraphicFramePr>
@@ -4966,7 +5401,7 @@
                     <pic:cNvPicPr/>
                   </pic:nvPicPr>
                   <pic:blipFill>
-                    <a:blip r:embed="rId19"/>
+                    <a:blip r:embed="rId22"/>
                     <a:stretch>
                       <a:fillRect/>
                     </a:stretch>
@@ -5082,7 +5517,7 @@
         <w:drawing>
           <wp:inline xmlns:a="http://schemas.openxmlformats.org/drawingml/2006/main" xmlns:pic="http://schemas.openxmlformats.org/drawingml/2006/picture">
             <wp:extent cx="5760720" cy="3600450"/>
-            <wp:docPr id="13" name="Picture 13"/>
+            <wp:docPr id="16" name="Picture 16"/>
             <wp:cNvGraphicFramePr>
               <a:graphicFrameLocks noChangeAspect="1"/>
             </wp:cNvGraphicFramePr>
@@ -5094,7 +5529,7 @@
                     <pic:cNvPicPr/>
                   </pic:nvPicPr>
                   <pic:blipFill>
-                    <a:blip r:embed="rId20"/>
+                    <a:blip r:embed="rId23"/>
                     <a:stretch>
                       <a:fillRect/>
                     </a:stretch>
@@ -6087,7 +6522,7 @@
           <w:color w:val="475569"/>
           <w:sz w:val="22"/>
         </w:rPr>
-        <w:t>This guide matches the eSariSari Admin module as of 1 September 2026. It does not replace the Internet Credits User Guide. Screenshots are layout references; live numbers depend on collections you confirm in this session.</w:t>
+        <w:t>Admin User Guide version 1.1  ·  2 September 2026. Matches the eSariSari Admin module on that date. It does not replace the Internet Credits User Guide (version 2.0). Screenshots are layout references; live numbers depend on collections you confirm in this session.</w:t>
       </w:r>
     </w:p>
     <w:sectPr>

</xml_diff>